<commit_message>
Regenerated API catalogue, touchpoints and data dictionary workbooks; go/no-go and management register
</commit_message>
<xml_diff>
--- a/docs/package/out/BrokerVerse_OOTB_Documentation_Pack_Index.docx
+++ b/docs/package/out/BrokerVerse_OOTB_Documentation_Pack_Index.docx
@@ -789,7 +789,7 @@
             </w:rPr>
             <w:fldChar w:fldCharType="separate"/>
           </w:r>
-          <w:hyperlink w:anchor="__RefHeading___Toc3110_3525619064">
+          <w:hyperlink w:anchor="__RefHeading___Toc3146_207083567">
             <w:r>
               <w:rPr>
                 <w:webHidden/>
@@ -824,7 +824,7 @@
             </w:tabs>
             <w:rPr/>
           </w:pPr>
-          <w:hyperlink w:anchor="__RefHeading___Toc3112_3525619064">
+          <w:hyperlink w:anchor="__RefHeading___Toc3148_207083567">
             <w:r>
               <w:rPr>
                 <w:webHidden/>
@@ -853,7 +853,7 @@
             </w:tabs>
             <w:rPr/>
           </w:pPr>
-          <w:hyperlink w:anchor="__RefHeading___Toc3114_3525619064">
+          <w:hyperlink w:anchor="__RefHeading___Toc3150_207083567">
             <w:r>
               <w:rPr>
                 <w:webHidden/>
@@ -875,7 +875,7 @@
             </w:tabs>
             <w:rPr/>
           </w:pPr>
-          <w:hyperlink w:anchor="__RefHeading___Toc3116_3525619064">
+          <w:hyperlink w:anchor="__RefHeading___Toc3152_207083567">
             <w:r>
               <w:rPr>
                 <w:webHidden/>
@@ -897,7 +897,7 @@
             </w:tabs>
             <w:rPr/>
           </w:pPr>
-          <w:hyperlink w:anchor="__RefHeading___Toc3118_3525619064">
+          <w:hyperlink w:anchor="__RefHeading___Toc3154_207083567">
             <w:r>
               <w:rPr>
                 <w:webHidden/>
@@ -919,7 +919,7 @@
             </w:tabs>
             <w:rPr/>
           </w:pPr>
-          <w:hyperlink w:anchor="__RefHeading___Toc3120_3525619064">
+          <w:hyperlink w:anchor="__RefHeading___Toc3156_207083567">
             <w:r>
               <w:rPr>
                 <w:webHidden/>
@@ -941,7 +941,7 @@
             </w:tabs>
             <w:rPr/>
           </w:pPr>
-          <w:hyperlink w:anchor="__RefHeading___Toc3122_3525619064">
+          <w:hyperlink w:anchor="__RefHeading___Toc3158_207083567">
             <w:r>
               <w:rPr>
                 <w:webHidden/>
@@ -963,7 +963,7 @@
             </w:tabs>
             <w:rPr/>
           </w:pPr>
-          <w:hyperlink w:anchor="__RefHeading___Toc3124_3525619064">
+          <w:hyperlink w:anchor="__RefHeading___Toc3160_207083567">
             <w:r>
               <w:rPr>
                 <w:webHidden/>
@@ -985,7 +985,7 @@
             </w:tabs>
             <w:rPr/>
           </w:pPr>
-          <w:hyperlink w:anchor="__RefHeading___Toc3126_3525619064">
+          <w:hyperlink w:anchor="__RefHeading___Toc3162_207083567">
             <w:r>
               <w:rPr>
                 <w:webHidden/>
@@ -1007,7 +1007,7 @@
             </w:tabs>
             <w:rPr/>
           </w:pPr>
-          <w:hyperlink w:anchor="__RefHeading___Toc3128_3525619064">
+          <w:hyperlink w:anchor="__RefHeading___Toc3164_207083567">
             <w:r>
               <w:rPr>
                 <w:webHidden/>
@@ -1029,7 +1029,7 @@
             </w:tabs>
             <w:rPr/>
           </w:pPr>
-          <w:hyperlink w:anchor="__RefHeading___Toc3130_3525619064">
+          <w:hyperlink w:anchor="__RefHeading___Toc3166_207083567">
             <w:r>
               <w:rPr>
                 <w:webHidden/>
@@ -1051,7 +1051,7 @@
             </w:tabs>
             <w:rPr/>
           </w:pPr>
-          <w:hyperlink w:anchor="__RefHeading___Toc3132_3525619064">
+          <w:hyperlink w:anchor="__RefHeading___Toc3168_207083567">
             <w:r>
               <w:rPr>
                 <w:webHidden/>
@@ -1073,7 +1073,7 @@
             </w:tabs>
             <w:rPr/>
           </w:pPr>
-          <w:hyperlink w:anchor="__RefHeading___Toc3134_3525619064">
+          <w:hyperlink w:anchor="__RefHeading___Toc3170_207083567">
             <w:r>
               <w:rPr>
                 <w:webHidden/>
@@ -1121,7 +1121,7 @@
       <w:r>
         <w:br w:type="page"/>
       </w:r>
-      <w:bookmarkStart w:id="0" w:name="__RefHeading___Toc3110_3525619064"/>
+      <w:bookmarkStart w:id="0" w:name="__RefHeading___Toc3146_207083567"/>
       <w:bookmarkStart w:id="1" w:name="_Toc48319687"/>
       <w:bookmarkStart w:id="2" w:name="_Toc11824118"/>
       <w:bookmarkEnd w:id="0"/>
@@ -1764,7 +1764,7 @@
           <w:spacing w:val="0"/>
         </w:rPr>
       </w:pPr>
-      <w:bookmarkStart w:id="4" w:name="__RefHeading___Toc3112_3525619064"/>
+      <w:bookmarkStart w:id="4" w:name="__RefHeading___Toc3148_207083567"/>
       <w:bookmarkStart w:id="5" w:name="_Toc233203388"/>
       <w:bookmarkEnd w:id="4"/>
       <w:r>
@@ -2990,7 +2990,7 @@
         <w:pageBreakBefore w:val="false"/>
         <w:rPr/>
       </w:pPr>
-      <w:bookmarkStart w:id="6" w:name="__RefHeading___Toc3114_3525619064"/>
+      <w:bookmarkStart w:id="6" w:name="__RefHeading___Toc3150_207083567"/>
       <w:bookmarkEnd w:id="6"/>
       <w:r>
         <w:rPr>
@@ -3262,7 +3262,7 @@
         <w:pStyle w:val="Heading1"/>
         <w:rPr/>
       </w:pPr>
-      <w:bookmarkStart w:id="7" w:name="__RefHeading___Toc3116_3525619064"/>
+      <w:bookmarkStart w:id="7" w:name="__RefHeading___Toc3152_207083567"/>
       <w:bookmarkEnd w:id="7"/>
       <w:r>
         <w:rPr>
@@ -3290,8 +3290,8 @@
         <w:tblLook w:val="04a0" w:noHBand="0" w:noVBand="1" w:firstColumn="1" w:lastRow="0" w:lastColumn="0" w:firstRow="1"/>
       </w:tblPr>
       <w:tblGrid>
-        <w:gridCol w:w="2742"/>
-        <w:gridCol w:w="6271"/>
+        <w:gridCol w:w="2833"/>
+        <w:gridCol w:w="6180"/>
       </w:tblGrid>
       <w:tr>
         <w:trPr>
@@ -3299,7 +3299,7 @@
         </w:trPr>
         <w:tc>
           <w:tcPr>
-            <w:tcW w:w="2742" w:type="dxa"/>
+            <w:tcW w:w="2833" w:type="dxa"/>
             <w:tcBorders>
               <w:top w:val="single" w:sz="4" w:space="0" w:color="BFC7D1"/>
               <w:left w:val="single" w:sz="4" w:space="0" w:color="BFC7D1"/>
@@ -3338,7 +3338,7 @@
         </w:tc>
         <w:tc>
           <w:tcPr>
-            <w:tcW w:w="6271" w:type="dxa"/>
+            <w:tcW w:w="6180" w:type="dxa"/>
             <w:tcBorders>
               <w:top w:val="single" w:sz="4" w:space="0" w:color="BFC7D1"/>
               <w:left w:val="single" w:sz="4" w:space="0" w:color="BFC7D1"/>
@@ -3380,44 +3380,44 @@
         <w:trPr/>
         <w:tc>
           <w:tcPr>
-            <w:tcW w:w="2742" w:type="dxa"/>
-            <w:tcBorders>
-              <w:top w:val="single" w:sz="4" w:space="0" w:color="BFC7D1"/>
-              <w:left w:val="single" w:sz="4" w:space="0" w:color="BFC7D1"/>
-              <w:bottom w:val="single" w:sz="4" w:space="0" w:color="BFC7D1"/>
-              <w:right w:val="single" w:sz="4" w:space="0" w:color="BFC7D1"/>
-            </w:tcBorders>
-          </w:tcPr>
-          <w:p>
-            <w:pPr>
-              <w:pStyle w:val="Normal"/>
-              <w:widowControl/>
-              <w:spacing w:lineRule="auto" w:line="240" w:before="0" w:after="20"/>
-              <w:jc w:val="left"/>
-              <w:rPr>
-                <w:rFonts w:ascii="Aptos" w:hAnsi="Aptos" w:eastAsia="ＭＳ 明朝" w:cs="Arial"/>
-                <w:kern w:val="0"/>
-                <w:sz w:val="24"/>
-                <w:szCs w:val="24"/>
-                <w:lang w:val="en-US" w:eastAsia="ja-JP" w:bidi="ar-SA"/>
-              </w:rPr>
-            </w:pPr>
-            <w:r>
-              <w:rPr>
-                <w:rFonts w:eastAsia="Segoe UI" w:cs="Segoe UI" w:ascii="Segoe UI" w:hAnsi="Segoe UI"/>
-                <w:color w:val="101820"/>
-                <w:kern w:val="0"/>
-                <w:sz w:val="18"/>
-                <w:szCs w:val="24"/>
-                <w:lang w:val="en-US" w:eastAsia="ja-JP" w:bidi="ar-SA"/>
-              </w:rPr>
-              <w:t>Sales (25 files)</w:t>
-            </w:r>
-          </w:p>
-        </w:tc>
-        <w:tc>
-          <w:tcPr>
-            <w:tcW w:w="6271" w:type="dxa"/>
+            <w:tcW w:w="2833" w:type="dxa"/>
+            <w:tcBorders>
+              <w:top w:val="single" w:sz="4" w:space="0" w:color="BFC7D1"/>
+              <w:left w:val="single" w:sz="4" w:space="0" w:color="BFC7D1"/>
+              <w:bottom w:val="single" w:sz="4" w:space="0" w:color="BFC7D1"/>
+              <w:right w:val="single" w:sz="4" w:space="0" w:color="BFC7D1"/>
+            </w:tcBorders>
+          </w:tcPr>
+          <w:p>
+            <w:pPr>
+              <w:pStyle w:val="Normal"/>
+              <w:widowControl/>
+              <w:spacing w:lineRule="auto" w:line="240" w:before="0" w:after="20"/>
+              <w:jc w:val="left"/>
+              <w:rPr>
+                <w:rFonts w:ascii="Aptos" w:hAnsi="Aptos" w:eastAsia="ＭＳ 明朝" w:cs="Arial"/>
+                <w:kern w:val="0"/>
+                <w:sz w:val="24"/>
+                <w:szCs w:val="24"/>
+                <w:lang w:val="en-US" w:eastAsia="ja-JP" w:bidi="ar-SA"/>
+              </w:rPr>
+            </w:pPr>
+            <w:r>
+              <w:rPr>
+                <w:rFonts w:eastAsia="Segoe UI" w:cs="Segoe UI" w:ascii="Segoe UI" w:hAnsi="Segoe UI"/>
+                <w:color w:val="101820"/>
+                <w:kern w:val="0"/>
+                <w:sz w:val="18"/>
+                <w:szCs w:val="24"/>
+                <w:lang w:val="en-US" w:eastAsia="ja-JP" w:bidi="ar-SA"/>
+              </w:rPr>
+              <w:t>Sales (26 files)</w:t>
+            </w:r>
+          </w:p>
+        </w:tc>
+        <w:tc>
+          <w:tcPr>
+            <w:tcW w:w="6180" w:type="dxa"/>
             <w:tcBorders>
               <w:top w:val="single" w:sz="4" w:space="0" w:color="BFC7D1"/>
               <w:left w:val="single" w:sz="4" w:space="0" w:color="BFC7D1"/>
@@ -3457,44 +3457,44 @@
         <w:trPr/>
         <w:tc>
           <w:tcPr>
-            <w:tcW w:w="2742" w:type="dxa"/>
-            <w:tcBorders>
-              <w:top w:val="single" w:sz="4" w:space="0" w:color="BFC7D1"/>
-              <w:left w:val="single" w:sz="4" w:space="0" w:color="BFC7D1"/>
-              <w:bottom w:val="single" w:sz="4" w:space="0" w:color="BFC7D1"/>
-              <w:right w:val="single" w:sz="4" w:space="0" w:color="BFC7D1"/>
-            </w:tcBorders>
-          </w:tcPr>
-          <w:p>
-            <w:pPr>
-              <w:pStyle w:val="Normal"/>
-              <w:widowControl/>
-              <w:spacing w:lineRule="auto" w:line="240" w:before="0" w:after="20"/>
-              <w:jc w:val="left"/>
-              <w:rPr>
-                <w:rFonts w:ascii="Aptos" w:hAnsi="Aptos" w:eastAsia="ＭＳ 明朝" w:cs="Arial"/>
-                <w:kern w:val="0"/>
-                <w:sz w:val="24"/>
-                <w:szCs w:val="24"/>
-                <w:lang w:val="en-US" w:eastAsia="ja-JP" w:bidi="ar-SA"/>
-              </w:rPr>
-            </w:pPr>
-            <w:r>
-              <w:rPr>
-                <w:rFonts w:eastAsia="Segoe UI" w:cs="Segoe UI" w:ascii="Segoe UI" w:hAnsi="Segoe UI"/>
-                <w:color w:val="101820"/>
-                <w:kern w:val="0"/>
-                <w:sz w:val="18"/>
-                <w:szCs w:val="24"/>
-                <w:lang w:val="en-US" w:eastAsia="ja-JP" w:bidi="ar-SA"/>
-              </w:rPr>
-              <w:t>Delivery (30 files)</w:t>
-            </w:r>
-          </w:p>
-        </w:tc>
-        <w:tc>
-          <w:tcPr>
-            <w:tcW w:w="6271" w:type="dxa"/>
+            <w:tcW w:w="2833" w:type="dxa"/>
+            <w:tcBorders>
+              <w:top w:val="single" w:sz="4" w:space="0" w:color="BFC7D1"/>
+              <w:left w:val="single" w:sz="4" w:space="0" w:color="BFC7D1"/>
+              <w:bottom w:val="single" w:sz="4" w:space="0" w:color="BFC7D1"/>
+              <w:right w:val="single" w:sz="4" w:space="0" w:color="BFC7D1"/>
+            </w:tcBorders>
+          </w:tcPr>
+          <w:p>
+            <w:pPr>
+              <w:pStyle w:val="Normal"/>
+              <w:widowControl/>
+              <w:spacing w:lineRule="auto" w:line="240" w:before="0" w:after="20"/>
+              <w:jc w:val="left"/>
+              <w:rPr>
+                <w:rFonts w:ascii="Aptos" w:hAnsi="Aptos" w:eastAsia="ＭＳ 明朝" w:cs="Arial"/>
+                <w:kern w:val="0"/>
+                <w:sz w:val="24"/>
+                <w:szCs w:val="24"/>
+                <w:lang w:val="en-US" w:eastAsia="ja-JP" w:bidi="ar-SA"/>
+              </w:rPr>
+            </w:pPr>
+            <w:r>
+              <w:rPr>
+                <w:rFonts w:eastAsia="Segoe UI" w:cs="Segoe UI" w:ascii="Segoe UI" w:hAnsi="Segoe UI"/>
+                <w:color w:val="101820"/>
+                <w:kern w:val="0"/>
+                <w:sz w:val="18"/>
+                <w:szCs w:val="24"/>
+                <w:lang w:val="en-US" w:eastAsia="ja-JP" w:bidi="ar-SA"/>
+              </w:rPr>
+              <w:t>Delivery (31 files)</w:t>
+            </w:r>
+          </w:p>
+        </w:tc>
+        <w:tc>
+          <w:tcPr>
+            <w:tcW w:w="6180" w:type="dxa"/>
             <w:tcBorders>
               <w:top w:val="single" w:sz="4" w:space="0" w:color="BFC7D1"/>
               <w:left w:val="single" w:sz="4" w:space="0" w:color="BFC7D1"/>
@@ -3534,44 +3534,44 @@
         <w:trPr/>
         <w:tc>
           <w:tcPr>
-            <w:tcW w:w="2742" w:type="dxa"/>
-            <w:tcBorders>
-              <w:top w:val="single" w:sz="4" w:space="0" w:color="BFC7D1"/>
-              <w:left w:val="single" w:sz="4" w:space="0" w:color="BFC7D1"/>
-              <w:bottom w:val="single" w:sz="4" w:space="0" w:color="BFC7D1"/>
-              <w:right w:val="single" w:sz="4" w:space="0" w:color="BFC7D1"/>
-            </w:tcBorders>
-          </w:tcPr>
-          <w:p>
-            <w:pPr>
-              <w:pStyle w:val="Normal"/>
-              <w:widowControl/>
-              <w:spacing w:lineRule="auto" w:line="240" w:before="0" w:after="20"/>
-              <w:jc w:val="left"/>
-              <w:rPr>
-                <w:rFonts w:ascii="Aptos" w:hAnsi="Aptos" w:eastAsia="ＭＳ 明朝" w:cs="Arial"/>
-                <w:kern w:val="0"/>
-                <w:sz w:val="24"/>
-                <w:szCs w:val="24"/>
-                <w:lang w:val="en-US" w:eastAsia="ja-JP" w:bidi="ar-SA"/>
-              </w:rPr>
-            </w:pPr>
-            <w:r>
-              <w:rPr>
-                <w:rFonts w:eastAsia="Segoe UI" w:cs="Segoe UI" w:ascii="Segoe UI" w:hAnsi="Segoe UI"/>
-                <w:color w:val="101820"/>
-                <w:kern w:val="0"/>
-                <w:sz w:val="18"/>
-                <w:szCs w:val="24"/>
-                <w:lang w:val="en-US" w:eastAsia="ja-JP" w:bidi="ar-SA"/>
-              </w:rPr>
-              <w:t>Development (9 files)</w:t>
-            </w:r>
-          </w:p>
-        </w:tc>
-        <w:tc>
-          <w:tcPr>
-            <w:tcW w:w="6271" w:type="dxa"/>
+            <w:tcW w:w="2833" w:type="dxa"/>
+            <w:tcBorders>
+              <w:top w:val="single" w:sz="4" w:space="0" w:color="BFC7D1"/>
+              <w:left w:val="single" w:sz="4" w:space="0" w:color="BFC7D1"/>
+              <w:bottom w:val="single" w:sz="4" w:space="0" w:color="BFC7D1"/>
+              <w:right w:val="single" w:sz="4" w:space="0" w:color="BFC7D1"/>
+            </w:tcBorders>
+          </w:tcPr>
+          <w:p>
+            <w:pPr>
+              <w:pStyle w:val="Normal"/>
+              <w:widowControl/>
+              <w:spacing w:lineRule="auto" w:line="240" w:before="0" w:after="20"/>
+              <w:jc w:val="left"/>
+              <w:rPr>
+                <w:rFonts w:ascii="Aptos" w:hAnsi="Aptos" w:eastAsia="ＭＳ 明朝" w:cs="Arial"/>
+                <w:kern w:val="0"/>
+                <w:sz w:val="24"/>
+                <w:szCs w:val="24"/>
+                <w:lang w:val="en-US" w:eastAsia="ja-JP" w:bidi="ar-SA"/>
+              </w:rPr>
+            </w:pPr>
+            <w:r>
+              <w:rPr>
+                <w:rFonts w:eastAsia="Segoe UI" w:cs="Segoe UI" w:ascii="Segoe UI" w:hAnsi="Segoe UI"/>
+                <w:color w:val="101820"/>
+                <w:kern w:val="0"/>
+                <w:sz w:val="18"/>
+                <w:szCs w:val="24"/>
+                <w:lang w:val="en-US" w:eastAsia="ja-JP" w:bidi="ar-SA"/>
+              </w:rPr>
+              <w:t>Development (10 files)</w:t>
+            </w:r>
+          </w:p>
+        </w:tc>
+        <w:tc>
+          <w:tcPr>
+            <w:tcW w:w="6180" w:type="dxa"/>
             <w:tcBorders>
               <w:top w:val="single" w:sz="4" w:space="0" w:color="BFC7D1"/>
               <w:left w:val="single" w:sz="4" w:space="0" w:color="BFC7D1"/>
@@ -3611,44 +3611,44 @@
         <w:trPr/>
         <w:tc>
           <w:tcPr>
-            <w:tcW w:w="2742" w:type="dxa"/>
-            <w:tcBorders>
-              <w:top w:val="single" w:sz="4" w:space="0" w:color="BFC7D1"/>
-              <w:left w:val="single" w:sz="4" w:space="0" w:color="BFC7D1"/>
-              <w:bottom w:val="single" w:sz="4" w:space="0" w:color="BFC7D1"/>
-              <w:right w:val="single" w:sz="4" w:space="0" w:color="BFC7D1"/>
-            </w:tcBorders>
-          </w:tcPr>
-          <w:p>
-            <w:pPr>
-              <w:pStyle w:val="Normal"/>
-              <w:widowControl/>
-              <w:spacing w:lineRule="auto" w:line="240" w:before="0" w:after="20"/>
-              <w:jc w:val="left"/>
-              <w:rPr>
-                <w:rFonts w:ascii="Aptos" w:hAnsi="Aptos" w:eastAsia="ＭＳ 明朝" w:cs="Arial"/>
-                <w:kern w:val="0"/>
-                <w:sz w:val="24"/>
-                <w:szCs w:val="24"/>
-                <w:lang w:val="en-US" w:eastAsia="ja-JP" w:bidi="ar-SA"/>
-              </w:rPr>
-            </w:pPr>
-            <w:r>
-              <w:rPr>
-                <w:rFonts w:eastAsia="Segoe UI" w:cs="Segoe UI" w:ascii="Segoe UI" w:hAnsi="Segoe UI"/>
-                <w:color w:val="101820"/>
-                <w:kern w:val="0"/>
-                <w:sz w:val="18"/>
-                <w:szCs w:val="24"/>
-                <w:lang w:val="en-US" w:eastAsia="ja-JP" w:bidi="ar-SA"/>
-              </w:rPr>
-              <w:t>Support (20 files)</w:t>
-            </w:r>
-          </w:p>
-        </w:tc>
-        <w:tc>
-          <w:tcPr>
-            <w:tcW w:w="6271" w:type="dxa"/>
+            <w:tcW w:w="2833" w:type="dxa"/>
+            <w:tcBorders>
+              <w:top w:val="single" w:sz="4" w:space="0" w:color="BFC7D1"/>
+              <w:left w:val="single" w:sz="4" w:space="0" w:color="BFC7D1"/>
+              <w:bottom w:val="single" w:sz="4" w:space="0" w:color="BFC7D1"/>
+              <w:right w:val="single" w:sz="4" w:space="0" w:color="BFC7D1"/>
+            </w:tcBorders>
+          </w:tcPr>
+          <w:p>
+            <w:pPr>
+              <w:pStyle w:val="Normal"/>
+              <w:widowControl/>
+              <w:spacing w:lineRule="auto" w:line="240" w:before="0" w:after="20"/>
+              <w:jc w:val="left"/>
+              <w:rPr>
+                <w:rFonts w:ascii="Aptos" w:hAnsi="Aptos" w:eastAsia="ＭＳ 明朝" w:cs="Arial"/>
+                <w:kern w:val="0"/>
+                <w:sz w:val="24"/>
+                <w:szCs w:val="24"/>
+                <w:lang w:val="en-US" w:eastAsia="ja-JP" w:bidi="ar-SA"/>
+              </w:rPr>
+            </w:pPr>
+            <w:r>
+              <w:rPr>
+                <w:rFonts w:eastAsia="Segoe UI" w:cs="Segoe UI" w:ascii="Segoe UI" w:hAnsi="Segoe UI"/>
+                <w:color w:val="101820"/>
+                <w:kern w:val="0"/>
+                <w:sz w:val="18"/>
+                <w:szCs w:val="24"/>
+                <w:lang w:val="en-US" w:eastAsia="ja-JP" w:bidi="ar-SA"/>
+              </w:rPr>
+              <w:t>Support (21 files)</w:t>
+            </w:r>
+          </w:p>
+        </w:tc>
+        <w:tc>
+          <w:tcPr>
+            <w:tcW w:w="6180" w:type="dxa"/>
             <w:tcBorders>
               <w:top w:val="single" w:sz="4" w:space="0" w:color="BFC7D1"/>
               <w:left w:val="single" w:sz="4" w:space="0" w:color="BFC7D1"/>
@@ -3688,44 +3688,44 @@
         <w:trPr/>
         <w:tc>
           <w:tcPr>
-            <w:tcW w:w="2742" w:type="dxa"/>
-            <w:tcBorders>
-              <w:top w:val="single" w:sz="4" w:space="0" w:color="BFC7D1"/>
-              <w:left w:val="single" w:sz="4" w:space="0" w:color="BFC7D1"/>
-              <w:bottom w:val="single" w:sz="4" w:space="0" w:color="BFC7D1"/>
-              <w:right w:val="single" w:sz="4" w:space="0" w:color="BFC7D1"/>
-            </w:tcBorders>
-          </w:tcPr>
-          <w:p>
-            <w:pPr>
-              <w:pStyle w:val="Normal"/>
-              <w:widowControl/>
-              <w:spacing w:lineRule="auto" w:line="240" w:before="0" w:after="20"/>
-              <w:jc w:val="left"/>
-              <w:rPr>
-                <w:rFonts w:ascii="Aptos" w:hAnsi="Aptos" w:eastAsia="ＭＳ 明朝" w:cs="Arial"/>
-                <w:kern w:val="0"/>
-                <w:sz w:val="24"/>
-                <w:szCs w:val="24"/>
-                <w:lang w:val="en-US" w:eastAsia="ja-JP" w:bidi="ar-SA"/>
-              </w:rPr>
-            </w:pPr>
-            <w:r>
-              <w:rPr>
-                <w:rFonts w:eastAsia="Segoe UI" w:cs="Segoe UI" w:ascii="Segoe UI" w:hAnsi="Segoe UI"/>
-                <w:color w:val="101820"/>
-                <w:kern w:val="0"/>
-                <w:sz w:val="18"/>
-                <w:szCs w:val="24"/>
-                <w:lang w:val="en-US" w:eastAsia="ja-JP" w:bidi="ar-SA"/>
-              </w:rPr>
-              <w:t>Management (37 files)</w:t>
-            </w:r>
-          </w:p>
-        </w:tc>
-        <w:tc>
-          <w:tcPr>
-            <w:tcW w:w="6271" w:type="dxa"/>
+            <w:tcW w:w="2833" w:type="dxa"/>
+            <w:tcBorders>
+              <w:top w:val="single" w:sz="4" w:space="0" w:color="BFC7D1"/>
+              <w:left w:val="single" w:sz="4" w:space="0" w:color="BFC7D1"/>
+              <w:bottom w:val="single" w:sz="4" w:space="0" w:color="BFC7D1"/>
+              <w:right w:val="single" w:sz="4" w:space="0" w:color="BFC7D1"/>
+            </w:tcBorders>
+          </w:tcPr>
+          <w:p>
+            <w:pPr>
+              <w:pStyle w:val="Normal"/>
+              <w:widowControl/>
+              <w:spacing w:lineRule="auto" w:line="240" w:before="0" w:after="20"/>
+              <w:jc w:val="left"/>
+              <w:rPr>
+                <w:rFonts w:ascii="Aptos" w:hAnsi="Aptos" w:eastAsia="ＭＳ 明朝" w:cs="Arial"/>
+                <w:kern w:val="0"/>
+                <w:sz w:val="24"/>
+                <w:szCs w:val="24"/>
+                <w:lang w:val="en-US" w:eastAsia="ja-JP" w:bidi="ar-SA"/>
+              </w:rPr>
+            </w:pPr>
+            <w:r>
+              <w:rPr>
+                <w:rFonts w:eastAsia="Segoe UI" w:cs="Segoe UI" w:ascii="Segoe UI" w:hAnsi="Segoe UI"/>
+                <w:color w:val="101820"/>
+                <w:kern w:val="0"/>
+                <w:sz w:val="18"/>
+                <w:szCs w:val="24"/>
+                <w:lang w:val="en-US" w:eastAsia="ja-JP" w:bidi="ar-SA"/>
+              </w:rPr>
+              <w:t>Management (38 files)</w:t>
+            </w:r>
+          </w:p>
+        </w:tc>
+        <w:tc>
+          <w:tcPr>
+            <w:tcW w:w="6180" w:type="dxa"/>
             <w:tcBorders>
               <w:top w:val="single" w:sz="4" w:space="0" w:color="BFC7D1"/>
               <w:left w:val="single" w:sz="4" w:space="0" w:color="BFC7D1"/>
@@ -3770,7 +3770,7 @@
       <w:r>
         <w:br w:type="page"/>
       </w:r>
-      <w:bookmarkStart w:id="8" w:name="__RefHeading___Toc3118_3525619064"/>
+      <w:bookmarkStart w:id="8" w:name="__RefHeading___Toc3154_207083567"/>
       <w:bookmarkEnd w:id="8"/>
       <w:r>
         <w:rPr>
@@ -4187,7 +4187,7 @@
                 <w:szCs w:val="24"/>
                 <w:lang w:val="en-US" w:eastAsia="ja-JP" w:bidi="ar-SA"/>
               </w:rPr>
-              <w:t>OOTB Strategy and Playbook (INTERNAL); Release Notes and Roadmap; UAT and Go Live Acceptance Certificates; Hypercare Exit and Handover Certificate; RAID Log Template; Project Status Report Template; Data Migration and Cutover Plan; Privacy Impact Assessment and Records of Processing Templates; User Manual; Schedules and Batch Jobs; Test Cases; Test Summary Report; Production Support Approach and Standards; OOTB Documentation Pack Index</w:t>
+              <w:t>OOTB Strategy and Playbook (INTERNAL); Release Notes and Roadmap; UAT and Go Live Acceptance Certificates; Hypercare Exit and Handover Certificate; RAID Log Template; Project Status Report Template; Data Migration and Cutover Plan; Privacy Impact Assessment and Records of Processing Templates; User Manual; Schedules and Batch Jobs; Test Cases; Test Summary Report; Go No Go and Management Register (INTERNAL); Production Support Approach and Standards; OOTB Documentation Pack Index</w:t>
             </w:r>
           </w:p>
         </w:tc>
@@ -4278,7 +4278,7 @@
       <w:r>
         <w:br w:type="page"/>
       </w:r>
-      <w:bookmarkStart w:id="9" w:name="__RefHeading___Toc3120_3525619064"/>
+      <w:bookmarkStart w:id="9" w:name="__RefHeading___Toc3156_207083567"/>
       <w:bookmarkEnd w:id="9"/>
       <w:r>
         <w:rPr>
@@ -4295,7 +4295,7 @@
         <w:pStyle w:val="Heading2"/>
         <w:rPr/>
       </w:pPr>
-      <w:bookmarkStart w:id="10" w:name="__RefHeading___Toc3122_3525619064"/>
+      <w:bookmarkStart w:id="10" w:name="__RefHeading___Toc3158_207083567"/>
       <w:bookmarkEnd w:id="10"/>
       <w:r>
         <w:rPr>
@@ -8976,7 +8976,7 @@
         <w:pStyle w:val="Heading2"/>
         <w:rPr/>
       </w:pPr>
-      <w:bookmarkStart w:id="11" w:name="__RefHeading___Toc3124_3525619064"/>
+      <w:bookmarkStart w:id="11" w:name="__RefHeading___Toc3160_207083567"/>
       <w:bookmarkEnd w:id="11"/>
       <w:r>
         <w:rPr>
@@ -12840,7 +12840,7 @@
         <w:pStyle w:val="Heading2"/>
         <w:rPr/>
       </w:pPr>
-      <w:bookmarkStart w:id="12" w:name="__RefHeading___Toc3126_3525619064"/>
+      <w:bookmarkStart w:id="12" w:name="__RefHeading___Toc3162_207083567"/>
       <w:bookmarkEnd w:id="12"/>
       <w:r>
         <w:rPr>
@@ -12855,7 +12855,7 @@
     <w:tbl>
       <w:tblPr>
         <w:tblStyle w:val="TableGrid"/>
-        <w:tblW w:w="9014" w:type="dxa"/>
+        <w:tblW w:w="9013" w:type="dxa"/>
         <w:jc w:val="left"/>
         <w:tblInd w:w="0" w:type="dxa"/>
         <w:tblLayout w:type="fixed"/>
@@ -12868,10 +12868,10 @@
         <w:tblLook w:val="04a0" w:noHBand="0" w:noVBand="1" w:firstColumn="1" w:lastRow="0" w:lastColumn="0" w:firstRow="1"/>
       </w:tblPr>
       <w:tblGrid>
-        <w:gridCol w:w="2737"/>
-        <w:gridCol w:w="2739"/>
-        <w:gridCol w:w="1711"/>
-        <w:gridCol w:w="1826"/>
+        <w:gridCol w:w="2457"/>
+        <w:gridCol w:w="2458"/>
+        <w:gridCol w:w="2459"/>
+        <w:gridCol w:w="1638"/>
       </w:tblGrid>
       <w:tr>
         <w:trPr>
@@ -12879,7 +12879,7 @@
         </w:trPr>
         <w:tc>
           <w:tcPr>
-            <w:tcW w:w="2737" w:type="dxa"/>
+            <w:tcW w:w="2457" w:type="dxa"/>
             <w:tcBorders>
               <w:top w:val="single" w:sz="4" w:space="0" w:color="BFC7D1"/>
               <w:left w:val="single" w:sz="4" w:space="0" w:color="BFC7D1"/>
@@ -12918,7 +12918,7 @@
         </w:tc>
         <w:tc>
           <w:tcPr>
-            <w:tcW w:w="2739" w:type="dxa"/>
+            <w:tcW w:w="2458" w:type="dxa"/>
             <w:tcBorders>
               <w:top w:val="single" w:sz="4" w:space="0" w:color="BFC7D1"/>
               <w:left w:val="single" w:sz="4" w:space="0" w:color="BFC7D1"/>
@@ -12957,7 +12957,7 @@
         </w:tc>
         <w:tc>
           <w:tcPr>
-            <w:tcW w:w="1711" w:type="dxa"/>
+            <w:tcW w:w="2459" w:type="dxa"/>
             <w:tcBorders>
               <w:top w:val="single" w:sz="4" w:space="0" w:color="BFC7D1"/>
               <w:left w:val="single" w:sz="4" w:space="0" w:color="BFC7D1"/>
@@ -12996,7 +12996,7 @@
         </w:tc>
         <w:tc>
           <w:tcPr>
-            <w:tcW w:w="1826" w:type="dxa"/>
+            <w:tcW w:w="1638" w:type="dxa"/>
             <w:tcBorders>
               <w:top w:val="single" w:sz="4" w:space="0" w:color="BFC7D1"/>
               <w:left w:val="single" w:sz="4" w:space="0" w:color="BFC7D1"/>
@@ -13038,7 +13038,7 @@
         <w:trPr/>
         <w:tc>
           <w:tcPr>
-            <w:tcW w:w="2737" w:type="dxa"/>
+            <w:tcW w:w="2457" w:type="dxa"/>
             <w:tcBorders>
               <w:top w:val="single" w:sz="4" w:space="0" w:color="BFC7D1"/>
               <w:left w:val="single" w:sz="4" w:space="0" w:color="BFC7D1"/>
@@ -13101,7 +13101,7 @@
         </w:tc>
         <w:tc>
           <w:tcPr>
-            <w:tcW w:w="2739" w:type="dxa"/>
+            <w:tcW w:w="2458" w:type="dxa"/>
             <w:tcBorders>
               <w:top w:val="single" w:sz="4" w:space="0" w:color="BFC7D1"/>
               <w:left w:val="single" w:sz="4" w:space="0" w:color="BFC7D1"/>
@@ -13138,7 +13138,7 @@
         </w:tc>
         <w:tc>
           <w:tcPr>
-            <w:tcW w:w="1711" w:type="dxa"/>
+            <w:tcW w:w="2459" w:type="dxa"/>
             <w:tcBorders>
               <w:top w:val="single" w:sz="4" w:space="0" w:color="BFC7D1"/>
               <w:left w:val="single" w:sz="4" w:space="0" w:color="BFC7D1"/>
@@ -13201,7 +13201,7 @@
         </w:tc>
         <w:tc>
           <w:tcPr>
-            <w:tcW w:w="1826" w:type="dxa"/>
+            <w:tcW w:w="1638" w:type="dxa"/>
             <w:tcBorders>
               <w:top w:val="single" w:sz="4" w:space="0" w:color="BFC7D1"/>
               <w:left w:val="single" w:sz="4" w:space="0" w:color="BFC7D1"/>
@@ -13241,7 +13241,7 @@
         <w:trPr/>
         <w:tc>
           <w:tcPr>
-            <w:tcW w:w="2737" w:type="dxa"/>
+            <w:tcW w:w="2457" w:type="dxa"/>
             <w:tcBorders>
               <w:top w:val="single" w:sz="4" w:space="0" w:color="BFC7D1"/>
               <w:left w:val="single" w:sz="4" w:space="0" w:color="BFC7D1"/>
@@ -13304,7 +13304,7 @@
         </w:tc>
         <w:tc>
           <w:tcPr>
-            <w:tcW w:w="2739" w:type="dxa"/>
+            <w:tcW w:w="2458" w:type="dxa"/>
             <w:tcBorders>
               <w:top w:val="single" w:sz="4" w:space="0" w:color="BFC7D1"/>
               <w:left w:val="single" w:sz="4" w:space="0" w:color="BFC7D1"/>
@@ -13341,7 +13341,7 @@
         </w:tc>
         <w:tc>
           <w:tcPr>
-            <w:tcW w:w="1711" w:type="dxa"/>
+            <w:tcW w:w="2459" w:type="dxa"/>
             <w:tcBorders>
               <w:top w:val="single" w:sz="4" w:space="0" w:color="BFC7D1"/>
               <w:left w:val="single" w:sz="4" w:space="0" w:color="BFC7D1"/>
@@ -13404,7 +13404,7 @@
         </w:tc>
         <w:tc>
           <w:tcPr>
-            <w:tcW w:w="1826" w:type="dxa"/>
+            <w:tcW w:w="1638" w:type="dxa"/>
             <w:tcBorders>
               <w:top w:val="single" w:sz="4" w:space="0" w:color="BFC7D1"/>
               <w:left w:val="single" w:sz="4" w:space="0" w:color="BFC7D1"/>
@@ -13444,7 +13444,7 @@
         <w:trPr/>
         <w:tc>
           <w:tcPr>
-            <w:tcW w:w="2737" w:type="dxa"/>
+            <w:tcW w:w="2457" w:type="dxa"/>
             <w:tcBorders>
               <w:top w:val="single" w:sz="4" w:space="0" w:color="BFC7D1"/>
               <w:left w:val="single" w:sz="4" w:space="0" w:color="BFC7D1"/>
@@ -13507,7 +13507,7 @@
         </w:tc>
         <w:tc>
           <w:tcPr>
-            <w:tcW w:w="2739" w:type="dxa"/>
+            <w:tcW w:w="2458" w:type="dxa"/>
             <w:tcBorders>
               <w:top w:val="single" w:sz="4" w:space="0" w:color="BFC7D1"/>
               <w:left w:val="single" w:sz="4" w:space="0" w:color="BFC7D1"/>
@@ -13544,7 +13544,7 @@
         </w:tc>
         <w:tc>
           <w:tcPr>
-            <w:tcW w:w="1711" w:type="dxa"/>
+            <w:tcW w:w="2459" w:type="dxa"/>
             <w:tcBorders>
               <w:top w:val="single" w:sz="4" w:space="0" w:color="BFC7D1"/>
               <w:left w:val="single" w:sz="4" w:space="0" w:color="BFC7D1"/>
@@ -13607,7 +13607,7 @@
         </w:tc>
         <w:tc>
           <w:tcPr>
-            <w:tcW w:w="1826" w:type="dxa"/>
+            <w:tcW w:w="1638" w:type="dxa"/>
             <w:tcBorders>
               <w:top w:val="single" w:sz="4" w:space="0" w:color="BFC7D1"/>
               <w:left w:val="single" w:sz="4" w:space="0" w:color="BFC7D1"/>
@@ -13647,7 +13647,7 @@
         <w:trPr/>
         <w:tc>
           <w:tcPr>
-            <w:tcW w:w="2737" w:type="dxa"/>
+            <w:tcW w:w="2457" w:type="dxa"/>
             <w:tcBorders>
               <w:top w:val="single" w:sz="4" w:space="0" w:color="BFC7D1"/>
               <w:left w:val="single" w:sz="4" w:space="0" w:color="BFC7D1"/>
@@ -13710,7 +13710,7 @@
         </w:tc>
         <w:tc>
           <w:tcPr>
-            <w:tcW w:w="2739" w:type="dxa"/>
+            <w:tcW w:w="2458" w:type="dxa"/>
             <w:tcBorders>
               <w:top w:val="single" w:sz="4" w:space="0" w:color="BFC7D1"/>
               <w:left w:val="single" w:sz="4" w:space="0" w:color="BFC7D1"/>
@@ -13747,7 +13747,7 @@
         </w:tc>
         <w:tc>
           <w:tcPr>
-            <w:tcW w:w="1711" w:type="dxa"/>
+            <w:tcW w:w="2459" w:type="dxa"/>
             <w:tcBorders>
               <w:top w:val="single" w:sz="4" w:space="0" w:color="BFC7D1"/>
               <w:left w:val="single" w:sz="4" w:space="0" w:color="BFC7D1"/>
@@ -13810,7 +13810,7 @@
         </w:tc>
         <w:tc>
           <w:tcPr>
-            <w:tcW w:w="1826" w:type="dxa"/>
+            <w:tcW w:w="1638" w:type="dxa"/>
             <w:tcBorders>
               <w:top w:val="single" w:sz="4" w:space="0" w:color="BFC7D1"/>
               <w:left w:val="single" w:sz="4" w:space="0" w:color="BFC7D1"/>
@@ -13850,7 +13850,7 @@
         <w:trPr/>
         <w:tc>
           <w:tcPr>
-            <w:tcW w:w="2737" w:type="dxa"/>
+            <w:tcW w:w="2457" w:type="dxa"/>
             <w:tcBorders>
               <w:top w:val="single" w:sz="4" w:space="0" w:color="BFC7D1"/>
               <w:left w:val="single" w:sz="4" w:space="0" w:color="BFC7D1"/>
@@ -13913,7 +13913,7 @@
         </w:tc>
         <w:tc>
           <w:tcPr>
-            <w:tcW w:w="2739" w:type="dxa"/>
+            <w:tcW w:w="2458" w:type="dxa"/>
             <w:tcBorders>
               <w:top w:val="single" w:sz="4" w:space="0" w:color="BFC7D1"/>
               <w:left w:val="single" w:sz="4" w:space="0" w:color="BFC7D1"/>
@@ -13950,7 +13950,7 @@
         </w:tc>
         <w:tc>
           <w:tcPr>
-            <w:tcW w:w="1711" w:type="dxa"/>
+            <w:tcW w:w="2459" w:type="dxa"/>
             <w:tcBorders>
               <w:top w:val="single" w:sz="4" w:space="0" w:color="BFC7D1"/>
               <w:left w:val="single" w:sz="4" w:space="0" w:color="BFC7D1"/>
@@ -14013,7 +14013,7 @@
         </w:tc>
         <w:tc>
           <w:tcPr>
-            <w:tcW w:w="1826" w:type="dxa"/>
+            <w:tcW w:w="1638" w:type="dxa"/>
             <w:tcBorders>
               <w:top w:val="single" w:sz="4" w:space="0" w:color="BFC7D1"/>
               <w:left w:val="single" w:sz="4" w:space="0" w:color="BFC7D1"/>
@@ -14053,7 +14053,7 @@
         <w:trPr/>
         <w:tc>
           <w:tcPr>
-            <w:tcW w:w="2737" w:type="dxa"/>
+            <w:tcW w:w="2457" w:type="dxa"/>
             <w:tcBorders>
               <w:top w:val="single" w:sz="4" w:space="0" w:color="BFC7D1"/>
               <w:left w:val="single" w:sz="4" w:space="0" w:color="BFC7D1"/>
@@ -14116,7 +14116,7 @@
         </w:tc>
         <w:tc>
           <w:tcPr>
-            <w:tcW w:w="2739" w:type="dxa"/>
+            <w:tcW w:w="2458" w:type="dxa"/>
             <w:tcBorders>
               <w:top w:val="single" w:sz="4" w:space="0" w:color="BFC7D1"/>
               <w:left w:val="single" w:sz="4" w:space="0" w:color="BFC7D1"/>
@@ -14153,7 +14153,7 @@
         </w:tc>
         <w:tc>
           <w:tcPr>
-            <w:tcW w:w="1711" w:type="dxa"/>
+            <w:tcW w:w="2459" w:type="dxa"/>
             <w:tcBorders>
               <w:top w:val="single" w:sz="4" w:space="0" w:color="BFC7D1"/>
               <w:left w:val="single" w:sz="4" w:space="0" w:color="BFC7D1"/>
@@ -14216,7 +14216,7 @@
         </w:tc>
         <w:tc>
           <w:tcPr>
-            <w:tcW w:w="1826" w:type="dxa"/>
+            <w:tcW w:w="1638" w:type="dxa"/>
             <w:tcBorders>
               <w:top w:val="single" w:sz="4" w:space="0" w:color="BFC7D1"/>
               <w:left w:val="single" w:sz="4" w:space="0" w:color="BFC7D1"/>
@@ -14256,7 +14256,7 @@
         <w:trPr/>
         <w:tc>
           <w:tcPr>
-            <w:tcW w:w="2737" w:type="dxa"/>
+            <w:tcW w:w="2457" w:type="dxa"/>
             <w:tcBorders>
               <w:top w:val="single" w:sz="4" w:space="0" w:color="BFC7D1"/>
               <w:left w:val="single" w:sz="4" w:space="0" w:color="BFC7D1"/>
@@ -14319,7 +14319,7 @@
         </w:tc>
         <w:tc>
           <w:tcPr>
-            <w:tcW w:w="2739" w:type="dxa"/>
+            <w:tcW w:w="2458" w:type="dxa"/>
             <w:tcBorders>
               <w:top w:val="single" w:sz="4" w:space="0" w:color="BFC7D1"/>
               <w:left w:val="single" w:sz="4" w:space="0" w:color="BFC7D1"/>
@@ -14356,7 +14356,7 @@
         </w:tc>
         <w:tc>
           <w:tcPr>
-            <w:tcW w:w="1711" w:type="dxa"/>
+            <w:tcW w:w="2459" w:type="dxa"/>
             <w:tcBorders>
               <w:top w:val="single" w:sz="4" w:space="0" w:color="BFC7D1"/>
               <w:left w:val="single" w:sz="4" w:space="0" w:color="BFC7D1"/>
@@ -14419,7 +14419,7 @@
         </w:tc>
         <w:tc>
           <w:tcPr>
-            <w:tcW w:w="1826" w:type="dxa"/>
+            <w:tcW w:w="1638" w:type="dxa"/>
             <w:tcBorders>
               <w:top w:val="single" w:sz="4" w:space="0" w:color="BFC7D1"/>
               <w:left w:val="single" w:sz="4" w:space="0" w:color="BFC7D1"/>
@@ -14459,7 +14459,7 @@
         <w:trPr/>
         <w:tc>
           <w:tcPr>
-            <w:tcW w:w="2737" w:type="dxa"/>
+            <w:tcW w:w="2457" w:type="dxa"/>
             <w:tcBorders>
               <w:top w:val="single" w:sz="4" w:space="0" w:color="BFC7D1"/>
               <w:left w:val="single" w:sz="4" w:space="0" w:color="BFC7D1"/>
@@ -14522,7 +14522,7 @@
         </w:tc>
         <w:tc>
           <w:tcPr>
-            <w:tcW w:w="2739" w:type="dxa"/>
+            <w:tcW w:w="2458" w:type="dxa"/>
             <w:tcBorders>
               <w:top w:val="single" w:sz="4" w:space="0" w:color="BFC7D1"/>
               <w:left w:val="single" w:sz="4" w:space="0" w:color="BFC7D1"/>
@@ -14559,7 +14559,7 @@
         </w:tc>
         <w:tc>
           <w:tcPr>
-            <w:tcW w:w="1711" w:type="dxa"/>
+            <w:tcW w:w="2459" w:type="dxa"/>
             <w:tcBorders>
               <w:top w:val="single" w:sz="4" w:space="0" w:color="BFC7D1"/>
               <w:left w:val="single" w:sz="4" w:space="0" w:color="BFC7D1"/>
@@ -14622,7 +14622,7 @@
         </w:tc>
         <w:tc>
           <w:tcPr>
-            <w:tcW w:w="1826" w:type="dxa"/>
+            <w:tcW w:w="1638" w:type="dxa"/>
             <w:tcBorders>
               <w:top w:val="single" w:sz="4" w:space="0" w:color="BFC7D1"/>
               <w:left w:val="single" w:sz="4" w:space="0" w:color="BFC7D1"/>
@@ -14662,7 +14662,7 @@
         <w:trPr/>
         <w:tc>
           <w:tcPr>
-            <w:tcW w:w="2737" w:type="dxa"/>
+            <w:tcW w:w="2457" w:type="dxa"/>
             <w:tcBorders>
               <w:top w:val="single" w:sz="4" w:space="0" w:color="BFC7D1"/>
               <w:left w:val="single" w:sz="4" w:space="0" w:color="BFC7D1"/>
@@ -14725,7 +14725,7 @@
         </w:tc>
         <w:tc>
           <w:tcPr>
-            <w:tcW w:w="2739" w:type="dxa"/>
+            <w:tcW w:w="2458" w:type="dxa"/>
             <w:tcBorders>
               <w:top w:val="single" w:sz="4" w:space="0" w:color="BFC7D1"/>
               <w:left w:val="single" w:sz="4" w:space="0" w:color="BFC7D1"/>
@@ -14762,7 +14762,7 @@
         </w:tc>
         <w:tc>
           <w:tcPr>
-            <w:tcW w:w="1711" w:type="dxa"/>
+            <w:tcW w:w="2459" w:type="dxa"/>
             <w:tcBorders>
               <w:top w:val="single" w:sz="4" w:space="0" w:color="BFC7D1"/>
               <w:left w:val="single" w:sz="4" w:space="0" w:color="BFC7D1"/>
@@ -14825,7 +14825,7 @@
         </w:tc>
         <w:tc>
           <w:tcPr>
-            <w:tcW w:w="1826" w:type="dxa"/>
+            <w:tcW w:w="1638" w:type="dxa"/>
             <w:tcBorders>
               <w:top w:val="single" w:sz="4" w:space="0" w:color="BFC7D1"/>
               <w:left w:val="single" w:sz="4" w:space="0" w:color="BFC7D1"/>
@@ -14865,7 +14865,7 @@
         <w:trPr/>
         <w:tc>
           <w:tcPr>
-            <w:tcW w:w="2737" w:type="dxa"/>
+            <w:tcW w:w="2457" w:type="dxa"/>
             <w:tcBorders>
               <w:top w:val="single" w:sz="4" w:space="0" w:color="BFC7D1"/>
               <w:left w:val="single" w:sz="4" w:space="0" w:color="BFC7D1"/>
@@ -14928,7 +14928,7 @@
         </w:tc>
         <w:tc>
           <w:tcPr>
-            <w:tcW w:w="2739" w:type="dxa"/>
+            <w:tcW w:w="2458" w:type="dxa"/>
             <w:tcBorders>
               <w:top w:val="single" w:sz="4" w:space="0" w:color="BFC7D1"/>
               <w:left w:val="single" w:sz="4" w:space="0" w:color="BFC7D1"/>
@@ -14965,7 +14965,7 @@
         </w:tc>
         <w:tc>
           <w:tcPr>
-            <w:tcW w:w="1711" w:type="dxa"/>
+            <w:tcW w:w="2459" w:type="dxa"/>
             <w:tcBorders>
               <w:top w:val="single" w:sz="4" w:space="0" w:color="BFC7D1"/>
               <w:left w:val="single" w:sz="4" w:space="0" w:color="BFC7D1"/>
@@ -15028,7 +15028,7 @@
         </w:tc>
         <w:tc>
           <w:tcPr>
-            <w:tcW w:w="1826" w:type="dxa"/>
+            <w:tcW w:w="1638" w:type="dxa"/>
             <w:tcBorders>
               <w:top w:val="single" w:sz="4" w:space="0" w:color="BFC7D1"/>
               <w:left w:val="single" w:sz="4" w:space="0" w:color="BFC7D1"/>
@@ -15068,7 +15068,7 @@
         <w:trPr/>
         <w:tc>
           <w:tcPr>
-            <w:tcW w:w="2737" w:type="dxa"/>
+            <w:tcW w:w="2457" w:type="dxa"/>
             <w:tcBorders>
               <w:top w:val="single" w:sz="4" w:space="0" w:color="BFC7D1"/>
               <w:left w:val="single" w:sz="4" w:space="0" w:color="BFC7D1"/>
@@ -15131,7 +15131,7 @@
         </w:tc>
         <w:tc>
           <w:tcPr>
-            <w:tcW w:w="2739" w:type="dxa"/>
+            <w:tcW w:w="2458" w:type="dxa"/>
             <w:tcBorders>
               <w:top w:val="single" w:sz="4" w:space="0" w:color="BFC7D1"/>
               <w:left w:val="single" w:sz="4" w:space="0" w:color="BFC7D1"/>
@@ -15168,7 +15168,7 @@
         </w:tc>
         <w:tc>
           <w:tcPr>
-            <w:tcW w:w="1711" w:type="dxa"/>
+            <w:tcW w:w="2459" w:type="dxa"/>
             <w:tcBorders>
               <w:top w:val="single" w:sz="4" w:space="0" w:color="BFC7D1"/>
               <w:left w:val="single" w:sz="4" w:space="0" w:color="BFC7D1"/>
@@ -15231,7 +15231,7 @@
         </w:tc>
         <w:tc>
           <w:tcPr>
-            <w:tcW w:w="1826" w:type="dxa"/>
+            <w:tcW w:w="1638" w:type="dxa"/>
             <w:tcBorders>
               <w:top w:val="single" w:sz="4" w:space="0" w:color="BFC7D1"/>
               <w:left w:val="single" w:sz="4" w:space="0" w:color="BFC7D1"/>
@@ -15271,7 +15271,7 @@
         <w:trPr/>
         <w:tc>
           <w:tcPr>
-            <w:tcW w:w="2737" w:type="dxa"/>
+            <w:tcW w:w="2457" w:type="dxa"/>
             <w:tcBorders>
               <w:top w:val="single" w:sz="4" w:space="0" w:color="BFC7D1"/>
               <w:left w:val="single" w:sz="4" w:space="0" w:color="BFC7D1"/>
@@ -15334,7 +15334,7 @@
         </w:tc>
         <w:tc>
           <w:tcPr>
-            <w:tcW w:w="2739" w:type="dxa"/>
+            <w:tcW w:w="2458" w:type="dxa"/>
             <w:tcBorders>
               <w:top w:val="single" w:sz="4" w:space="0" w:color="BFC7D1"/>
               <w:left w:val="single" w:sz="4" w:space="0" w:color="BFC7D1"/>
@@ -15371,7 +15371,7 @@
         </w:tc>
         <w:tc>
           <w:tcPr>
-            <w:tcW w:w="1711" w:type="dxa"/>
+            <w:tcW w:w="2459" w:type="dxa"/>
             <w:tcBorders>
               <w:top w:val="single" w:sz="4" w:space="0" w:color="BFC7D1"/>
               <w:left w:val="single" w:sz="4" w:space="0" w:color="BFC7D1"/>
@@ -15434,7 +15434,7 @@
         </w:tc>
         <w:tc>
           <w:tcPr>
-            <w:tcW w:w="1826" w:type="dxa"/>
+            <w:tcW w:w="1638" w:type="dxa"/>
             <w:tcBorders>
               <w:top w:val="single" w:sz="4" w:space="0" w:color="BFC7D1"/>
               <w:left w:val="single" w:sz="4" w:space="0" w:color="BFC7D1"/>
@@ -15474,7 +15474,7 @@
         <w:trPr/>
         <w:tc>
           <w:tcPr>
-            <w:tcW w:w="2737" w:type="dxa"/>
+            <w:tcW w:w="2457" w:type="dxa"/>
             <w:tcBorders>
               <w:top w:val="single" w:sz="4" w:space="0" w:color="BFC7D1"/>
               <w:left w:val="single" w:sz="4" w:space="0" w:color="BFC7D1"/>
@@ -15537,7 +15537,7 @@
         </w:tc>
         <w:tc>
           <w:tcPr>
-            <w:tcW w:w="2739" w:type="dxa"/>
+            <w:tcW w:w="2458" w:type="dxa"/>
             <w:tcBorders>
               <w:top w:val="single" w:sz="4" w:space="0" w:color="BFC7D1"/>
               <w:left w:val="single" w:sz="4" w:space="0" w:color="BFC7D1"/>
@@ -15574,7 +15574,7 @@
         </w:tc>
         <w:tc>
           <w:tcPr>
-            <w:tcW w:w="1711" w:type="dxa"/>
+            <w:tcW w:w="2459" w:type="dxa"/>
             <w:tcBorders>
               <w:top w:val="single" w:sz="4" w:space="0" w:color="BFC7D1"/>
               <w:left w:val="single" w:sz="4" w:space="0" w:color="BFC7D1"/>
@@ -15637,7 +15637,7 @@
         </w:tc>
         <w:tc>
           <w:tcPr>
-            <w:tcW w:w="1826" w:type="dxa"/>
+            <w:tcW w:w="1638" w:type="dxa"/>
             <w:tcBorders>
               <w:top w:val="single" w:sz="4" w:space="0" w:color="BFC7D1"/>
               <w:left w:val="single" w:sz="4" w:space="0" w:color="BFC7D1"/>
@@ -15677,7 +15677,7 @@
         <w:trPr/>
         <w:tc>
           <w:tcPr>
-            <w:tcW w:w="2737" w:type="dxa"/>
+            <w:tcW w:w="2457" w:type="dxa"/>
             <w:tcBorders>
               <w:top w:val="single" w:sz="4" w:space="0" w:color="BFC7D1"/>
               <w:left w:val="single" w:sz="4" w:space="0" w:color="BFC7D1"/>
@@ -15740,7 +15740,7 @@
         </w:tc>
         <w:tc>
           <w:tcPr>
-            <w:tcW w:w="2739" w:type="dxa"/>
+            <w:tcW w:w="2458" w:type="dxa"/>
             <w:tcBorders>
               <w:top w:val="single" w:sz="4" w:space="0" w:color="BFC7D1"/>
               <w:left w:val="single" w:sz="4" w:space="0" w:color="BFC7D1"/>
@@ -15777,7 +15777,7 @@
         </w:tc>
         <w:tc>
           <w:tcPr>
-            <w:tcW w:w="1711" w:type="dxa"/>
+            <w:tcW w:w="2459" w:type="dxa"/>
             <w:tcBorders>
               <w:top w:val="single" w:sz="4" w:space="0" w:color="BFC7D1"/>
               <w:left w:val="single" w:sz="4" w:space="0" w:color="BFC7D1"/>
@@ -15840,7 +15840,7 @@
         </w:tc>
         <w:tc>
           <w:tcPr>
-            <w:tcW w:w="1826" w:type="dxa"/>
+            <w:tcW w:w="1638" w:type="dxa"/>
             <w:tcBorders>
               <w:top w:val="single" w:sz="4" w:space="0" w:color="BFC7D1"/>
               <w:left w:val="single" w:sz="4" w:space="0" w:color="BFC7D1"/>
@@ -15880,7 +15880,7 @@
         <w:trPr/>
         <w:tc>
           <w:tcPr>
-            <w:tcW w:w="2737" w:type="dxa"/>
+            <w:tcW w:w="2457" w:type="dxa"/>
             <w:tcBorders>
               <w:top w:val="single" w:sz="4" w:space="0" w:color="BFC7D1"/>
               <w:left w:val="single" w:sz="4" w:space="0" w:color="BFC7D1"/>
@@ -15943,7 +15943,7 @@
         </w:tc>
         <w:tc>
           <w:tcPr>
-            <w:tcW w:w="2739" w:type="dxa"/>
+            <w:tcW w:w="2458" w:type="dxa"/>
             <w:tcBorders>
               <w:top w:val="single" w:sz="4" w:space="0" w:color="BFC7D1"/>
               <w:left w:val="single" w:sz="4" w:space="0" w:color="BFC7D1"/>
@@ -15980,7 +15980,7 @@
         </w:tc>
         <w:tc>
           <w:tcPr>
-            <w:tcW w:w="1711" w:type="dxa"/>
+            <w:tcW w:w="2459" w:type="dxa"/>
             <w:tcBorders>
               <w:top w:val="single" w:sz="4" w:space="0" w:color="BFC7D1"/>
               <w:left w:val="single" w:sz="4" w:space="0" w:color="BFC7D1"/>
@@ -16043,7 +16043,7 @@
         </w:tc>
         <w:tc>
           <w:tcPr>
-            <w:tcW w:w="1826" w:type="dxa"/>
+            <w:tcW w:w="1638" w:type="dxa"/>
             <w:tcBorders>
               <w:top w:val="single" w:sz="4" w:space="0" w:color="BFC7D1"/>
               <w:left w:val="single" w:sz="4" w:space="0" w:color="BFC7D1"/>
@@ -16083,7 +16083,7 @@
         <w:trPr/>
         <w:tc>
           <w:tcPr>
-            <w:tcW w:w="2737" w:type="dxa"/>
+            <w:tcW w:w="2457" w:type="dxa"/>
             <w:tcBorders>
               <w:top w:val="single" w:sz="4" w:space="0" w:color="BFC7D1"/>
               <w:left w:val="single" w:sz="4" w:space="0" w:color="BFC7D1"/>
@@ -16146,7 +16146,7 @@
         </w:tc>
         <w:tc>
           <w:tcPr>
-            <w:tcW w:w="2739" w:type="dxa"/>
+            <w:tcW w:w="2458" w:type="dxa"/>
             <w:tcBorders>
               <w:top w:val="single" w:sz="4" w:space="0" w:color="BFC7D1"/>
               <w:left w:val="single" w:sz="4" w:space="0" w:color="BFC7D1"/>
@@ -16183,7 +16183,7 @@
         </w:tc>
         <w:tc>
           <w:tcPr>
-            <w:tcW w:w="1711" w:type="dxa"/>
+            <w:tcW w:w="2459" w:type="dxa"/>
             <w:tcBorders>
               <w:top w:val="single" w:sz="4" w:space="0" w:color="BFC7D1"/>
               <w:left w:val="single" w:sz="4" w:space="0" w:color="BFC7D1"/>
@@ -16246,7 +16246,7 @@
         </w:tc>
         <w:tc>
           <w:tcPr>
-            <w:tcW w:w="1826" w:type="dxa"/>
+            <w:tcW w:w="1638" w:type="dxa"/>
             <w:tcBorders>
               <w:top w:val="single" w:sz="4" w:space="0" w:color="BFC7D1"/>
               <w:left w:val="single" w:sz="4" w:space="0" w:color="BFC7D1"/>
@@ -16286,7 +16286,7 @@
         <w:trPr/>
         <w:tc>
           <w:tcPr>
-            <w:tcW w:w="2737" w:type="dxa"/>
+            <w:tcW w:w="2457" w:type="dxa"/>
             <w:tcBorders>
               <w:top w:val="single" w:sz="4" w:space="0" w:color="BFC7D1"/>
               <w:left w:val="single" w:sz="4" w:space="0" w:color="BFC7D1"/>
@@ -16317,7 +16317,7 @@
                 <w:szCs w:val="24"/>
                 <w:lang w:val="en-US" w:eastAsia="ja-JP" w:bidi="ar-SA"/>
               </w:rPr>
-              <w:t>BrokerVerse_Technical_Reference</w:t>
+              <w:t>BrokerVerse_Go_No_Go_and_Management_Register</w:t>
             </w:r>
           </w:p>
           <w:p>
@@ -16349,75 +16349,75 @@
         </w:tc>
         <w:tc>
           <w:tcPr>
-            <w:tcW w:w="2739" w:type="dxa"/>
-            <w:tcBorders>
-              <w:top w:val="single" w:sz="4" w:space="0" w:color="BFC7D1"/>
-              <w:left w:val="single" w:sz="4" w:space="0" w:color="BFC7D1"/>
-              <w:bottom w:val="single" w:sz="4" w:space="0" w:color="BFC7D1"/>
-              <w:right w:val="single" w:sz="4" w:space="0" w:color="BFC7D1"/>
-            </w:tcBorders>
-          </w:tcPr>
-          <w:p>
-            <w:pPr>
-              <w:pStyle w:val="Normal"/>
-              <w:widowControl/>
-              <w:spacing w:lineRule="auto" w:line="240" w:before="0" w:after="20"/>
-              <w:jc w:val="left"/>
-              <w:rPr>
-                <w:rFonts w:ascii="Aptos" w:hAnsi="Aptos" w:eastAsia="ＭＳ 明朝" w:cs="Arial"/>
-                <w:kern w:val="0"/>
-                <w:sz w:val="24"/>
-                <w:szCs w:val="24"/>
-                <w:lang w:val="en-US" w:eastAsia="ja-JP" w:bidi="ar-SA"/>
-              </w:rPr>
-            </w:pPr>
-            <w:r>
-              <w:rPr>
-                <w:rFonts w:eastAsia="Segoe UI" w:cs="Segoe UI" w:ascii="Segoe UI" w:hAnsi="Segoe UI"/>
-                <w:color w:val="101820"/>
-                <w:kern w:val="0"/>
-                <w:sz w:val="18"/>
-                <w:szCs w:val="24"/>
-                <w:lang w:val="en-US" w:eastAsia="ja-JP" w:bidi="ar-SA"/>
-              </w:rPr>
-              <w:t>Code base, modules, security implementation and how to extend</w:t>
-            </w:r>
-          </w:p>
-        </w:tc>
-        <w:tc>
-          <w:tcPr>
-            <w:tcW w:w="1711" w:type="dxa"/>
-            <w:tcBorders>
-              <w:top w:val="single" w:sz="4" w:space="0" w:color="BFC7D1"/>
-              <w:left w:val="single" w:sz="4" w:space="0" w:color="BFC7D1"/>
-              <w:bottom w:val="single" w:sz="4" w:space="0" w:color="BFC7D1"/>
-              <w:right w:val="single" w:sz="4" w:space="0" w:color="BFC7D1"/>
-            </w:tcBorders>
-          </w:tcPr>
-          <w:p>
-            <w:pPr>
-              <w:pStyle w:val="Normal"/>
-              <w:widowControl/>
-              <w:spacing w:lineRule="auto" w:line="240" w:before="0" w:after="20"/>
-              <w:jc w:val="left"/>
-              <w:rPr>
-                <w:rFonts w:ascii="Aptos" w:hAnsi="Aptos" w:eastAsia="ＭＳ 明朝" w:cs="Arial"/>
-                <w:kern w:val="0"/>
-                <w:sz w:val="24"/>
-                <w:szCs w:val="24"/>
-                <w:lang w:val="en-US" w:eastAsia="ja-JP" w:bidi="ar-SA"/>
-              </w:rPr>
-            </w:pPr>
-            <w:r>
-              <w:rPr>
-                <w:rFonts w:eastAsia="Segoe UI" w:cs="Segoe UI" w:ascii="Segoe UI" w:hAnsi="Segoe UI"/>
-                <w:color w:val="101820"/>
-                <w:kern w:val="0"/>
-                <w:sz w:val="18"/>
-                <w:szCs w:val="24"/>
-                <w:lang w:val="en-US" w:eastAsia="ja-JP" w:bidi="ar-SA"/>
-              </w:rPr>
-              <w:t>Development, Support</w:t>
+            <w:tcW w:w="2458" w:type="dxa"/>
+            <w:tcBorders>
+              <w:top w:val="single" w:sz="4" w:space="0" w:color="BFC7D1"/>
+              <w:left w:val="single" w:sz="4" w:space="0" w:color="BFC7D1"/>
+              <w:bottom w:val="single" w:sz="4" w:space="0" w:color="BFC7D1"/>
+              <w:right w:val="single" w:sz="4" w:space="0" w:color="BFC7D1"/>
+            </w:tcBorders>
+          </w:tcPr>
+          <w:p>
+            <w:pPr>
+              <w:pStyle w:val="Normal"/>
+              <w:widowControl/>
+              <w:spacing w:lineRule="auto" w:line="240" w:before="0" w:after="20"/>
+              <w:jc w:val="left"/>
+              <w:rPr>
+                <w:rFonts w:ascii="Aptos" w:hAnsi="Aptos" w:eastAsia="ＭＳ 明朝" w:cs="Arial"/>
+                <w:kern w:val="0"/>
+                <w:sz w:val="24"/>
+                <w:szCs w:val="24"/>
+                <w:lang w:val="en-US" w:eastAsia="ja-JP" w:bidi="ar-SA"/>
+              </w:rPr>
+            </w:pPr>
+            <w:r>
+              <w:rPr>
+                <w:rFonts w:eastAsia="Segoe UI" w:cs="Segoe UI" w:ascii="Segoe UI" w:hAnsi="Segoe UI"/>
+                <w:color w:val="101820"/>
+                <w:kern w:val="0"/>
+                <w:sz w:val="18"/>
+                <w:szCs w:val="24"/>
+                <w:lang w:val="en-US" w:eastAsia="ja-JP" w:bidi="ar-SA"/>
+              </w:rPr>
+              <w:t>Release recommendation, go-live conditions, risks, plans and decisions needed</w:t>
+            </w:r>
+          </w:p>
+        </w:tc>
+        <w:tc>
+          <w:tcPr>
+            <w:tcW w:w="2459" w:type="dxa"/>
+            <w:tcBorders>
+              <w:top w:val="single" w:sz="4" w:space="0" w:color="BFC7D1"/>
+              <w:left w:val="single" w:sz="4" w:space="0" w:color="BFC7D1"/>
+              <w:bottom w:val="single" w:sz="4" w:space="0" w:color="BFC7D1"/>
+              <w:right w:val="single" w:sz="4" w:space="0" w:color="BFC7D1"/>
+            </w:tcBorders>
+          </w:tcPr>
+          <w:p>
+            <w:pPr>
+              <w:pStyle w:val="Normal"/>
+              <w:widowControl/>
+              <w:spacing w:lineRule="auto" w:line="240" w:before="0" w:after="20"/>
+              <w:jc w:val="left"/>
+              <w:rPr>
+                <w:rFonts w:ascii="Aptos" w:hAnsi="Aptos" w:eastAsia="ＭＳ 明朝" w:cs="Arial"/>
+                <w:kern w:val="0"/>
+                <w:sz w:val="24"/>
+                <w:szCs w:val="24"/>
+                <w:lang w:val="en-US" w:eastAsia="ja-JP" w:bidi="ar-SA"/>
+              </w:rPr>
+            </w:pPr>
+            <w:r>
+              <w:rPr>
+                <w:rFonts w:eastAsia="Segoe UI" w:cs="Segoe UI" w:ascii="Segoe UI" w:hAnsi="Segoe UI"/>
+                <w:color w:val="101820"/>
+                <w:kern w:val="0"/>
+                <w:sz w:val="18"/>
+                <w:szCs w:val="24"/>
+                <w:lang w:val="en-US" w:eastAsia="ja-JP" w:bidi="ar-SA"/>
+              </w:rPr>
+              <w:t>Management, Delivery, Development, Support, Sales</w:t>
             </w:r>
           </w:p>
           <w:p>
@@ -16437,50 +16437,51 @@
             <w:r>
               <w:rPr>
                 <w:rFonts w:eastAsia="Segoe UI" w:cs="Segoe UI" w:ascii="Segoe UI" w:hAnsi="Segoe UI"/>
-                <w:color w:val="101820"/>
-                <w:kern w:val="0"/>
-                <w:sz w:val="18"/>
-                <w:szCs w:val="24"/>
-                <w:lang w:val="en-US" w:eastAsia="ja-JP" w:bidi="ar-SA"/>
-              </w:rPr>
-              <w:t>Client-facing</w:t>
-            </w:r>
-          </w:p>
-        </w:tc>
-        <w:tc>
-          <w:tcPr>
-            <w:tcW w:w="1826" w:type="dxa"/>
-            <w:tcBorders>
-              <w:top w:val="single" w:sz="4" w:space="0" w:color="BFC7D1"/>
-              <w:left w:val="single" w:sz="4" w:space="0" w:color="BFC7D1"/>
-              <w:bottom w:val="single" w:sz="4" w:space="0" w:color="BFC7D1"/>
-              <w:right w:val="single" w:sz="4" w:space="0" w:color="BFC7D1"/>
-            </w:tcBorders>
-          </w:tcPr>
-          <w:p>
-            <w:pPr>
-              <w:pStyle w:val="Normal"/>
-              <w:widowControl/>
-              <w:spacing w:lineRule="auto" w:line="240" w:before="0" w:after="20"/>
-              <w:jc w:val="left"/>
-              <w:rPr>
-                <w:rFonts w:ascii="Aptos" w:hAnsi="Aptos" w:eastAsia="ＭＳ 明朝" w:cs="Arial"/>
-                <w:kern w:val="0"/>
-                <w:sz w:val="24"/>
-                <w:szCs w:val="24"/>
-                <w:lang w:val="en-US" w:eastAsia="ja-JP" w:bidi="ar-SA"/>
-              </w:rPr>
-            </w:pPr>
-            <w:r>
-              <w:rPr>
-                <w:rFonts w:eastAsia="Segoe UI" w:cs="Segoe UI" w:ascii="Segoe UI" w:hAnsi="Segoe UI"/>
-                <w:color w:val="101820"/>
-                <w:kern w:val="0"/>
-                <w:sz w:val="18"/>
-                <w:szCs w:val="24"/>
-                <w:lang w:val="en-US" w:eastAsia="ja-JP" w:bidi="ar-SA"/>
-              </w:rPr>
-              <w:t>Implementation, Support</w:t>
+                <w:b/>
+                <w:color w:val="101820"/>
+                <w:kern w:val="0"/>
+                <w:sz w:val="18"/>
+                <w:szCs w:val="24"/>
+                <w:lang w:val="en-US" w:eastAsia="ja-JP" w:bidi="ar-SA"/>
+              </w:rPr>
+              <w:t>INTERNAL</w:t>
+            </w:r>
+          </w:p>
+        </w:tc>
+        <w:tc>
+          <w:tcPr>
+            <w:tcW w:w="1638" w:type="dxa"/>
+            <w:tcBorders>
+              <w:top w:val="single" w:sz="4" w:space="0" w:color="BFC7D1"/>
+              <w:left w:val="single" w:sz="4" w:space="0" w:color="BFC7D1"/>
+              <w:bottom w:val="single" w:sz="4" w:space="0" w:color="BFC7D1"/>
+              <w:right w:val="single" w:sz="4" w:space="0" w:color="BFC7D1"/>
+            </w:tcBorders>
+          </w:tcPr>
+          <w:p>
+            <w:pPr>
+              <w:pStyle w:val="Normal"/>
+              <w:widowControl/>
+              <w:spacing w:lineRule="auto" w:line="240" w:before="0" w:after="20"/>
+              <w:jc w:val="left"/>
+              <w:rPr>
+                <w:rFonts w:ascii="Aptos" w:hAnsi="Aptos" w:eastAsia="ＭＳ 明朝" w:cs="Arial"/>
+                <w:kern w:val="0"/>
+                <w:sz w:val="24"/>
+                <w:szCs w:val="24"/>
+                <w:lang w:val="en-US" w:eastAsia="ja-JP" w:bidi="ar-SA"/>
+              </w:rPr>
+            </w:pPr>
+            <w:r>
+              <w:rPr>
+                <w:rFonts w:eastAsia="Segoe UI" w:cs="Segoe UI" w:ascii="Segoe UI" w:hAnsi="Segoe UI"/>
+                <w:color w:val="101820"/>
+                <w:kern w:val="0"/>
+                <w:sz w:val="18"/>
+                <w:szCs w:val="24"/>
+                <w:lang w:val="en-US" w:eastAsia="ja-JP" w:bidi="ar-SA"/>
+              </w:rPr>
+              <w:t>Go-live</w:t>
             </w:r>
           </w:p>
         </w:tc>
@@ -16489,7 +16490,7 @@
         <w:trPr/>
         <w:tc>
           <w:tcPr>
-            <w:tcW w:w="2737" w:type="dxa"/>
+            <w:tcW w:w="2457" w:type="dxa"/>
             <w:tcBorders>
               <w:top w:val="single" w:sz="4" w:space="0" w:color="BFC7D1"/>
               <w:left w:val="single" w:sz="4" w:space="0" w:color="BFC7D1"/>
@@ -16520,6 +16521,209 @@
                 <w:szCs w:val="24"/>
                 <w:lang w:val="en-US" w:eastAsia="ja-JP" w:bidi="ar-SA"/>
               </w:rPr>
+              <w:t>BrokerVerse_Technical_Reference</w:t>
+            </w:r>
+          </w:p>
+          <w:p>
+            <w:pPr>
+              <w:pStyle w:val="Normal"/>
+              <w:widowControl/>
+              <w:spacing w:lineRule="auto" w:line="240" w:before="0" w:after="0"/>
+              <w:jc w:val="left"/>
+              <w:rPr>
+                <w:rFonts w:ascii="Aptos" w:hAnsi="Aptos" w:eastAsia="ＭＳ 明朝" w:cs="Arial"/>
+                <w:kern w:val="0"/>
+                <w:sz w:val="24"/>
+                <w:szCs w:val="24"/>
+                <w:lang w:val="en-US" w:eastAsia="ja-JP" w:bidi="ar-SA"/>
+              </w:rPr>
+            </w:pPr>
+            <w:r>
+              <w:rPr>
+                <w:rFonts w:eastAsia="Segoe UI" w:cs="Segoe UI" w:ascii="Segoe UI" w:hAnsi="Segoe UI"/>
+                <w:color w:val="101820"/>
+                <w:kern w:val="0"/>
+                <w:sz w:val="18"/>
+                <w:szCs w:val="24"/>
+                <w:lang w:val="en-US" w:eastAsia="ja-JP" w:bidi="ar-SA"/>
+              </w:rPr>
+              <w:t>docx, pdf</w:t>
+            </w:r>
+          </w:p>
+        </w:tc>
+        <w:tc>
+          <w:tcPr>
+            <w:tcW w:w="2458" w:type="dxa"/>
+            <w:tcBorders>
+              <w:top w:val="single" w:sz="4" w:space="0" w:color="BFC7D1"/>
+              <w:left w:val="single" w:sz="4" w:space="0" w:color="BFC7D1"/>
+              <w:bottom w:val="single" w:sz="4" w:space="0" w:color="BFC7D1"/>
+              <w:right w:val="single" w:sz="4" w:space="0" w:color="BFC7D1"/>
+            </w:tcBorders>
+          </w:tcPr>
+          <w:p>
+            <w:pPr>
+              <w:pStyle w:val="Normal"/>
+              <w:widowControl/>
+              <w:spacing w:lineRule="auto" w:line="240" w:before="0" w:after="20"/>
+              <w:jc w:val="left"/>
+              <w:rPr>
+                <w:rFonts w:ascii="Aptos" w:hAnsi="Aptos" w:eastAsia="ＭＳ 明朝" w:cs="Arial"/>
+                <w:kern w:val="0"/>
+                <w:sz w:val="24"/>
+                <w:szCs w:val="24"/>
+                <w:lang w:val="en-US" w:eastAsia="ja-JP" w:bidi="ar-SA"/>
+              </w:rPr>
+            </w:pPr>
+            <w:r>
+              <w:rPr>
+                <w:rFonts w:eastAsia="Segoe UI" w:cs="Segoe UI" w:ascii="Segoe UI" w:hAnsi="Segoe UI"/>
+                <w:color w:val="101820"/>
+                <w:kern w:val="0"/>
+                <w:sz w:val="18"/>
+                <w:szCs w:val="24"/>
+                <w:lang w:val="en-US" w:eastAsia="ja-JP" w:bidi="ar-SA"/>
+              </w:rPr>
+              <w:t>Code base, modules, security implementation and how to extend</w:t>
+            </w:r>
+          </w:p>
+        </w:tc>
+        <w:tc>
+          <w:tcPr>
+            <w:tcW w:w="2459" w:type="dxa"/>
+            <w:tcBorders>
+              <w:top w:val="single" w:sz="4" w:space="0" w:color="BFC7D1"/>
+              <w:left w:val="single" w:sz="4" w:space="0" w:color="BFC7D1"/>
+              <w:bottom w:val="single" w:sz="4" w:space="0" w:color="BFC7D1"/>
+              <w:right w:val="single" w:sz="4" w:space="0" w:color="BFC7D1"/>
+            </w:tcBorders>
+          </w:tcPr>
+          <w:p>
+            <w:pPr>
+              <w:pStyle w:val="Normal"/>
+              <w:widowControl/>
+              <w:spacing w:lineRule="auto" w:line="240" w:before="0" w:after="20"/>
+              <w:jc w:val="left"/>
+              <w:rPr>
+                <w:rFonts w:ascii="Aptos" w:hAnsi="Aptos" w:eastAsia="ＭＳ 明朝" w:cs="Arial"/>
+                <w:kern w:val="0"/>
+                <w:sz w:val="24"/>
+                <w:szCs w:val="24"/>
+                <w:lang w:val="en-US" w:eastAsia="ja-JP" w:bidi="ar-SA"/>
+              </w:rPr>
+            </w:pPr>
+            <w:r>
+              <w:rPr>
+                <w:rFonts w:eastAsia="Segoe UI" w:cs="Segoe UI" w:ascii="Segoe UI" w:hAnsi="Segoe UI"/>
+                <w:color w:val="101820"/>
+                <w:kern w:val="0"/>
+                <w:sz w:val="18"/>
+                <w:szCs w:val="24"/>
+                <w:lang w:val="en-US" w:eastAsia="ja-JP" w:bidi="ar-SA"/>
+              </w:rPr>
+              <w:t>Development, Support</w:t>
+            </w:r>
+          </w:p>
+          <w:p>
+            <w:pPr>
+              <w:pStyle w:val="Normal"/>
+              <w:widowControl/>
+              <w:spacing w:lineRule="auto" w:line="240" w:before="0" w:after="0"/>
+              <w:jc w:val="left"/>
+              <w:rPr>
+                <w:rFonts w:ascii="Aptos" w:hAnsi="Aptos" w:eastAsia="ＭＳ 明朝" w:cs="Arial"/>
+                <w:kern w:val="0"/>
+                <w:sz w:val="24"/>
+                <w:szCs w:val="24"/>
+                <w:lang w:val="en-US" w:eastAsia="ja-JP" w:bidi="ar-SA"/>
+              </w:rPr>
+            </w:pPr>
+            <w:r>
+              <w:rPr>
+                <w:rFonts w:eastAsia="Segoe UI" w:cs="Segoe UI" w:ascii="Segoe UI" w:hAnsi="Segoe UI"/>
+                <w:color w:val="101820"/>
+                <w:kern w:val="0"/>
+                <w:sz w:val="18"/>
+                <w:szCs w:val="24"/>
+                <w:lang w:val="en-US" w:eastAsia="ja-JP" w:bidi="ar-SA"/>
+              </w:rPr>
+              <w:t>Client-facing</w:t>
+            </w:r>
+          </w:p>
+        </w:tc>
+        <w:tc>
+          <w:tcPr>
+            <w:tcW w:w="1638" w:type="dxa"/>
+            <w:tcBorders>
+              <w:top w:val="single" w:sz="4" w:space="0" w:color="BFC7D1"/>
+              <w:left w:val="single" w:sz="4" w:space="0" w:color="BFC7D1"/>
+              <w:bottom w:val="single" w:sz="4" w:space="0" w:color="BFC7D1"/>
+              <w:right w:val="single" w:sz="4" w:space="0" w:color="BFC7D1"/>
+            </w:tcBorders>
+          </w:tcPr>
+          <w:p>
+            <w:pPr>
+              <w:pStyle w:val="Normal"/>
+              <w:widowControl/>
+              <w:spacing w:lineRule="auto" w:line="240" w:before="0" w:after="20"/>
+              <w:jc w:val="left"/>
+              <w:rPr>
+                <w:rFonts w:ascii="Aptos" w:hAnsi="Aptos" w:eastAsia="ＭＳ 明朝" w:cs="Arial"/>
+                <w:kern w:val="0"/>
+                <w:sz w:val="24"/>
+                <w:szCs w:val="24"/>
+                <w:lang w:val="en-US" w:eastAsia="ja-JP" w:bidi="ar-SA"/>
+              </w:rPr>
+            </w:pPr>
+            <w:r>
+              <w:rPr>
+                <w:rFonts w:eastAsia="Segoe UI" w:cs="Segoe UI" w:ascii="Segoe UI" w:hAnsi="Segoe UI"/>
+                <w:color w:val="101820"/>
+                <w:kern w:val="0"/>
+                <w:sz w:val="18"/>
+                <w:szCs w:val="24"/>
+                <w:lang w:val="en-US" w:eastAsia="ja-JP" w:bidi="ar-SA"/>
+              </w:rPr>
+              <w:t>Implementation, Support</w:t>
+            </w:r>
+          </w:p>
+        </w:tc>
+      </w:tr>
+      <w:tr>
+        <w:trPr/>
+        <w:tc>
+          <w:tcPr>
+            <w:tcW w:w="2457" w:type="dxa"/>
+            <w:tcBorders>
+              <w:top w:val="single" w:sz="4" w:space="0" w:color="BFC7D1"/>
+              <w:left w:val="single" w:sz="4" w:space="0" w:color="BFC7D1"/>
+              <w:bottom w:val="single" w:sz="4" w:space="0" w:color="BFC7D1"/>
+              <w:right w:val="single" w:sz="4" w:space="0" w:color="BFC7D1"/>
+            </w:tcBorders>
+          </w:tcPr>
+          <w:p>
+            <w:pPr>
+              <w:pStyle w:val="Normal"/>
+              <w:widowControl/>
+              <w:spacing w:lineRule="auto" w:line="240" w:before="0" w:after="20"/>
+              <w:jc w:val="left"/>
+              <w:rPr>
+                <w:rFonts w:ascii="Aptos" w:hAnsi="Aptos" w:eastAsia="ＭＳ 明朝" w:cs="Arial"/>
+                <w:kern w:val="0"/>
+                <w:sz w:val="24"/>
+                <w:szCs w:val="24"/>
+                <w:lang w:val="en-US" w:eastAsia="ja-JP" w:bidi="ar-SA"/>
+              </w:rPr>
+            </w:pPr>
+            <w:r>
+              <w:rPr>
+                <w:rFonts w:eastAsia="Consolas" w:cs="Consolas" w:ascii="Consolas" w:hAnsi="Consolas"/>
+                <w:color w:val="101820"/>
+                <w:kern w:val="0"/>
+                <w:sz w:val="16"/>
+                <w:szCs w:val="24"/>
+                <w:lang w:val="en-US" w:eastAsia="ja-JP" w:bidi="ar-SA"/>
+              </w:rPr>
               <w:t>BrokerVerse_API_and_Dependency_Catalogue</w:t>
             </w:r>
           </w:p>
@@ -16552,7 +16756,7 @@
         </w:tc>
         <w:tc>
           <w:tcPr>
-            <w:tcW w:w="2739" w:type="dxa"/>
+            <w:tcW w:w="2458" w:type="dxa"/>
             <w:tcBorders>
               <w:top w:val="single" w:sz="4" w:space="0" w:color="BFC7D1"/>
               <w:left w:val="single" w:sz="4" w:space="0" w:color="BFC7D1"/>
@@ -16589,7 +16793,7 @@
         </w:tc>
         <w:tc>
           <w:tcPr>
-            <w:tcW w:w="1711" w:type="dxa"/>
+            <w:tcW w:w="2459" w:type="dxa"/>
             <w:tcBorders>
               <w:top w:val="single" w:sz="4" w:space="0" w:color="BFC7D1"/>
               <w:left w:val="single" w:sz="4" w:space="0" w:color="BFC7D1"/>
@@ -16652,7 +16856,7 @@
         </w:tc>
         <w:tc>
           <w:tcPr>
-            <w:tcW w:w="1826" w:type="dxa"/>
+            <w:tcW w:w="1638" w:type="dxa"/>
             <w:tcBorders>
               <w:top w:val="single" w:sz="4" w:space="0" w:color="BFC7D1"/>
               <w:left w:val="single" w:sz="4" w:space="0" w:color="BFC7D1"/>
@@ -16704,7 +16908,7 @@
         <w:pStyle w:val="Heading2"/>
         <w:rPr/>
       </w:pPr>
-      <w:bookmarkStart w:id="13" w:name="__RefHeading___Toc3128_3525619064"/>
+      <w:bookmarkStart w:id="13" w:name="__RefHeading___Toc3164_207083567"/>
       <w:bookmarkEnd w:id="13"/>
       <w:r>
         <w:rPr>
@@ -17720,7 +17924,7 @@
       <w:r>
         <w:br w:type="page"/>
       </w:r>
-      <w:bookmarkStart w:id="14" w:name="__RefHeading___Toc3130_3525619064"/>
+      <w:bookmarkStart w:id="14" w:name="__RefHeading___Toc3166_207083567"/>
       <w:bookmarkEnd w:id="14"/>
       <w:r>
         <w:rPr>
@@ -17908,6 +18112,33 @@
         </w:rPr>
         <w:t xml:space="preserve"> (xlsx): Formula-driven pricing model behind the rate card.</w:t>
       </w:r>
+    </w:p>
+    <w:p>
+      <w:pPr>
+        <w:pStyle w:val="Normal"/>
+        <w:numPr>
+          <w:ilvl w:val="0"/>
+          <w:numId w:val="1"/>
+        </w:numPr>
+        <w:spacing w:before="0" w:after="60"/>
+        <w:rPr/>
+      </w:pPr>
+      <w:r>
+        <w:rPr>
+          <w:rFonts w:eastAsia="Consolas" w:cs="Consolas" w:ascii="Consolas" w:hAnsi="Consolas"/>
+          <w:color w:val="101820"/>
+          <w:sz w:val="19"/>
+        </w:rPr>
+        <w:t>out/BrokerVerse_Go_No_Go_and_Management_Register</w:t>
+      </w:r>
+      <w:r>
+        <w:rPr>
+          <w:rFonts w:eastAsia="Segoe UI" w:cs="Segoe UI" w:ascii="Segoe UI" w:hAnsi="Segoe UI"/>
+          <w:color w:val="101820"/>
+          <w:sz w:val="21"/>
+        </w:rPr>
+        <w:t xml:space="preserve"> (docx, pdf): Release recommendation, go-live conditions, risks, plans and decisions needed.</w:t>
+      </w:r>
       <w:r>
         <w:br w:type="page"/>
       </w:r>
@@ -17917,7 +18148,7 @@
         <w:pStyle w:val="Heading1"/>
         <w:rPr/>
       </w:pPr>
-      <w:bookmarkStart w:id="15" w:name="__RefHeading___Toc3132_3525619064"/>
+      <w:bookmarkStart w:id="15" w:name="__RefHeading___Toc3168_207083567"/>
       <w:bookmarkEnd w:id="15"/>
       <w:r>
         <w:rPr>
@@ -18250,7 +18481,7 @@
           <w:spacing w:val="0"/>
         </w:rPr>
       </w:pPr>
-      <w:bookmarkStart w:id="16" w:name="__RefHeading___Toc3134_3525619064"/>
+      <w:bookmarkStart w:id="16" w:name="__RefHeading___Toc3170_207083567"/>
       <w:bookmarkStart w:id="17" w:name="_Toc233203395"/>
       <w:bookmarkEnd w:id="16"/>
       <w:r>

</xml_diff>